<commit_message>
Rework Phase 2A pack to AI-native monthly release train (v2.0)
Replace the conventional four-release plan with an AI-native delivery model:
- 6 monthly releases, 2 features each: public launch on 20 Oct 2026 with
  F1/F2, then F3-F12 through to Phase 2A completion on 23 Mar 2027
- lean senior pod (~10-11 FTE, 67.25 person-months vs 154 conventional)
- WBS/plan: feature catalogue, release-train rules, rebuilt schedule and
  dependency register (adds D21 AI tooling approval), pod skills & loading
- Delivery Model: AI-augmented lifecycle with human gates, monthly train
  mechanics, AI governance (confidentiality, IP, audit), continuous KT,
  per-release commercial option
- Technical Approach: new AI-accelerated engineering section; feature and
  release references updated

Co-Authored-By: Claude Opus 5.5 <noreply@anthropic.com>
Claude-Session: https://claude.ai/code/session_01J895FnYXrgPC57efM14tYQ
</commit_message>
<xml_diff>
--- a/docs/phase-2a/03_Technical_Approach.docx
+++ b/docs/phase-2a/03_Technical_Approach.docx
@@ -531,7 +531,7 @@
                 <w:sz w:val="18"/>
                 <w:szCs w:val="18"/>
               </w:rPr>
-              <w:t xml:space="preserve">v1.0 — 27 September 2026</w:t>
+              <w:t xml:space="preserve">v2.0 (AI-native release train) — 27 September 2026</w:t>
             </w:r>
           </w:p>
         </w:tc>
@@ -606,7 +606,7 @@
                 <w:sz w:val="18"/>
                 <w:szCs w:val="18"/>
               </w:rPr>
-              <w:t xml:space="preserve">Issued for client review</w:t>
+              <w:t xml:space="preserve">Issued for client review — supersedes v1.0</w:t>
             </w:r>
           </w:p>
         </w:tc>
@@ -946,7 +946,7 @@
           <w:sz w:val="21"/>
           <w:szCs w:val="21"/>
         </w:rPr>
-        <w:t xml:space="preserve">9. Technical plan for the 20 October 2026 launch</w:t>
+        <w:t xml:space="preserve">9. AI-accelerated engineering</w:t>
       </w:r>
     </w:p>
     <w:p>
@@ -963,7 +963,7 @@
           <w:sz w:val="21"/>
           <w:szCs w:val="21"/>
         </w:rPr>
-        <w:t xml:space="preserve">10. Data migration approach</w:t>
+        <w:t xml:space="preserve">10. Technical plan for the 20 October 2026 launch</w:t>
       </w:r>
     </w:p>
     <w:p>
@@ -980,7 +980,7 @@
           <w:sz w:val="21"/>
           <w:szCs w:val="21"/>
         </w:rPr>
-        <w:t xml:space="preserve">11. Key technical decisions (ADR backlog)</w:t>
+        <w:t xml:space="preserve">11. Data migration approach</w:t>
       </w:r>
     </w:p>
     <w:p>
@@ -997,7 +997,7 @@
           <w:sz w:val="21"/>
           <w:szCs w:val="21"/>
         </w:rPr>
-        <w:t xml:space="preserve">12. Technical risks and mitigations</w:t>
+        <w:t xml:space="preserve">12. Key technical decisions (ADR backlog)</w:t>
       </w:r>
     </w:p>
     <w:p>
@@ -1014,7 +1014,24 @@
           <w:sz w:val="21"/>
           <w:szCs w:val="21"/>
         </w:rPr>
-        <w:t xml:space="preserve">13. Why Srivin Platforms</w:t>
+        <w:t xml:space="preserve">13. Technical risks and mitigations</w:t>
+      </w:r>
+    </w:p>
+    <w:p>
+      <w:pPr>
+        <w:pBdr>
+          <w:bottom w:val="dotted" w:color="D5D8DE" w:sz="4" w:space="3"/>
+        </w:pBdr>
+        <w:spacing w:after="90"/>
+      </w:pPr>
+      <w:r>
+        <w:rPr>
+          <w:rFonts w:ascii="Arial" w:cs="Arial" w:eastAsia="Arial" w:hAnsi="Arial"/>
+          <w:color w:val="1A1A1A"/>
+          <w:sz w:val="21"/>
+          <w:szCs w:val="21"/>
+        </w:rPr>
+        <w:t xml:space="preserve">14. Why Srivin Platforms</w:t>
       </w:r>
     </w:p>
     <w:p>
@@ -1083,14 +1100,14 @@
           <w:bCs/>
           <w:color w:val="1A1A1A"/>
         </w:rPr>
-        <w:t xml:space="preserve">Harden, then unify, then extend.</w:t>
-      </w:r>
-      <w:r>
-        <w:rPr>
-          <w:rFonts w:ascii="Arial" w:cs="Arial" w:eastAsia="Arial" w:hAnsi="Arial"/>
-          <w:color w:val="1A1A1A"/>
-        </w:rPr>
-        <w:t xml:space="preserve"> We make the live product safe for public traffic first (Release 2A.0, 20 Oct 2026). We then build the shared foundations every later module depends on, starting with Identity. Only then do we generalise partners, harden bookings, add the Ledger and complete the web application.</w:t>
+        <w:t xml:space="preserve">Harden, then unify, then extend, one month at a time.</w:t>
+      </w:r>
+      <w:r>
+        <w:rPr>
+          <w:rFonts w:ascii="Arial" w:cs="Arial" w:eastAsia="Arial" w:hAnsi="Arial"/>
+          <w:color w:val="1A1A1A"/>
+        </w:rPr>
+        <w:t xml:space="preserve"> We make the live product safe for public traffic and add two features on day one (R1, 20 Oct 2026). Then two features reach production every month, in dependency order: identity (R2), refunds and the player web app (R3), the generalised partner model (R4), the Ledger and partner web (R5), and payouts and WhatsApp (R6, 23 Mar 2027).</w:t>
       </w:r>
     </w:p>
     <w:p>
@@ -1213,14 +1230,14 @@
           <w:bCs/>
           <w:color w:val="1A1A1A"/>
         </w:rPr>
-        <w:t xml:space="preserve">Engineering quality you can inspect.</w:t>
-      </w:r>
-      <w:r>
-        <w:rPr>
-          <w:rFonts w:ascii="Arial" w:cs="Arial" w:eastAsia="Arial" w:hAnsi="Arial"/>
-          <w:color w:val="1A1A1A"/>
-        </w:rPr>
-        <w:t xml:space="preserve"> Automated tests, security scans, performance tests and observability are built into the pipeline from the first sprint, all inside SportSeek-owned infrastructure.</w:t>
+        <w:t xml:space="preserve">AI-accelerated, human-owned engineering.</w:t>
+      </w:r>
+      <w:r>
+        <w:rPr>
+          <w:rFonts w:ascii="Arial" w:cs="Arial" w:eastAsia="Arial" w:hAnsi="Arial"/>
+          <w:color w:val="1A1A1A"/>
+        </w:rPr>
+        <w:t xml:space="preserve"> AI coding agents build from approved specifications, generate tests and keep documentation current. Senior engineers review and own every change, and the same automated tests, security scans and performance tests apply to everything (Section 9).</w:t>
       </w:r>
     </w:p>
     <w:tbl>
@@ -1283,7 +1300,7 @@
                 <w:sz w:val="19"/>
                 <w:szCs w:val="19"/>
               </w:rPr>
-              <w:t xml:space="preserve">A public launch on 20 October 2026 on a product that has been security-tested, load-tested and instrumented. Phase 2A complete on 4 May 2027 in three accepted releases. A codebase, documentation and SportSeek engineering team able to carry Phase 2B and 2C forward.</w:t>
+              <w:t xml:space="preserve">A public launch on 20 October 2026 on a security-tested, load-tested and instrumented product, with two new features on day one. Two more features every month after that, and Phase 2A complete on 23 March 2027, delivered by a lean AI-native pod. A codebase, documentation and SportSeek engineering team able to carry Phase 2B and 2C forward.</w:t>
             </w:r>
           </w:p>
         </w:tc>
@@ -5524,7 +5541,7 @@
         <w:keepNext/>
       </w:pPr>
       <w:r>
-        <w:t xml:space="preserve">6.1 Shared Identity &amp; Profile (M2 — Release 2A.1)</w:t>
+        <w:t xml:space="preserve">6.1 Shared Identity &amp; Profile (F3 — R2, 24 Nov 2026)</w:t>
       </w:r>
     </w:p>
     <w:p>
@@ -6408,7 +6425,7 @@
         <w:keepNext/>
       </w:pPr>
       <w:r>
-        <w:t xml:space="preserve">6.2 Notification Platform (M6 — core in 2A.1, complete in 2A.2)</w:t>
+        <w:t xml:space="preserve">6.2 Notification Platform (F1, F2 — R1; F4 — R2; F12 — R6)</w:t>
       </w:r>
     </w:p>
     <w:p>
@@ -6625,7 +6642,7 @@
         <w:keepNext/>
       </w:pPr>
       <w:r>
-        <w:t xml:space="preserve">6.3 Partner &amp; Service Management — generalised (M5 — Release 2A.2)</w:t>
+        <w:t xml:space="preserve">6.3 Partner &amp; Service Management — generalised (F7 — R4; payouts F11 — R6)</w:t>
       </w:r>
     </w:p>
     <w:p>
@@ -6816,7 +6833,7 @@
         <w:keepNext/>
       </w:pPr>
       <w:r>
-        <w:t xml:space="preserve">6.4 Booking, Events &amp; Tournaments hardening (M4 — Release 2A.2)</w:t>
+        <w:t xml:space="preserve">6.4 Booking, Events &amp; Tournaments hardening (F5 — R3; F8 — R4)</w:t>
       </w:r>
     </w:p>
     <w:p>
@@ -7033,7 +7050,7 @@
         <w:keepNext/>
       </w:pPr>
       <w:r>
-        <w:t xml:space="preserve">6.5 Transaction Ledger (M3 — Release 2A.3)</w:t>
+        <w:t xml:space="preserve">6.5 Transaction Ledger (F9 — R5; settlement view F11 — R6)</w:t>
       </w:r>
     </w:p>
     <w:p>
@@ -7355,7 +7372,7 @@
         <w:keepNext/>
       </w:pPr>
       <w:r>
-        <w:t xml:space="preserve">6.6 Web Application (Release 2A.3, built from Dec 2026)</w:t>
+        <w:t xml:space="preserve">6.6 Web Application (F6 players — R3; F10 organisers &amp; partners — R5)</w:t>
       </w:r>
     </w:p>
     <w:p>
@@ -8050,7 +8067,7 @@
                 <w:sz w:val="17"/>
                 <w:szCs w:val="17"/>
               </w:rPr>
-              <w:t xml:space="preserve">VAPT before each go-live (launch surface for 2A.0; full scope before 2A.3), with no critical or high findings open at release (SOW §14.1).</w:t>
+              <w:t xml:space="preserve">VAPT before each go-live (launch surface for R1; targeted tests for identity R2, refunds R3 and payouts R6; full scope before Phase 2A completion in R6), with no critical or high findings open at release (SOW §14.1).</w:t>
             </w:r>
           </w:p>
         </w:tc>
@@ -9192,7 +9209,7 @@
         <w:pageBreakBefore/>
       </w:pPr>
       <w:r>
-        <w:t xml:space="preserve">9. Technical plan for the 20 October 2026 launch</w:t>
+        <w:t xml:space="preserve">9. AI-accelerated engineering</w:t>
       </w:r>
     </w:p>
     <w:p>
@@ -9204,7 +9221,1077 @@
           <w:rFonts w:ascii="Arial" w:cs="Arial" w:eastAsia="Arial" w:hAnsi="Arial"/>
           <w:color w:val="1A1A1A"/>
         </w:rPr>
-        <w:t xml:space="preserve">For launch we deliberately avoid changes to identity, payments or the data model. The engineering work is about making the existing system safe, visible and recoverable under public load.</w:t>
+        <w:t xml:space="preserve">Speed comes from putting AI agents into every engineering step while keeping senior engineers accountable for every outcome. This is how a pod of about 10 people ships two production features a month on a live payments platform.</w:t>
+      </w:r>
+    </w:p>
+    <w:p>
+      <w:pPr>
+        <w:pStyle w:val="Heading2"/>
+        <w:keepNext/>
+      </w:pPr>
+      <w:r>
+        <w:t xml:space="preserve">9.1 Spec-driven development</w:t>
+      </w:r>
+    </w:p>
+    <w:p>
+      <w:pPr>
+        <w:pStyle w:val="ListParagraph"/>
+        <w:numPr>
+          <w:ilvl w:val="0"/>
+          <w:numId w:val="5"/>
+        </w:numPr>
+        <w:spacing w:after="60" w:line="264"/>
+      </w:pPr>
+      <w:r>
+        <w:rPr>
+          <w:rFonts w:ascii="Arial" w:cs="Arial" w:eastAsia="Arial" w:hAnsi="Arial"/>
+          <w:b/>
+          <w:bCs/>
+          <w:color w:val="1A1A1A"/>
+        </w:rPr>
+        <w:t xml:space="preserve">Specify</w:t>
+      </w:r>
+      <w:r>
+        <w:rPr>
+          <w:rFonts w:ascii="Arial" w:cs="Arial" w:eastAsia="Arial" w:hAnsi="Arial"/>
+          <w:color w:val="1A1A1A"/>
+        </w:rPr>
+        <w:t xml:space="preserve">: the analyst and architect, working with AI, produce a feature spec: user stories, acceptance criteria, API contract (OpenAPI), data changes, UI frames, and security notes for sensitive areas. The PO approves it.</w:t>
+      </w:r>
+    </w:p>
+    <w:p>
+      <w:pPr>
+        <w:pStyle w:val="ListParagraph"/>
+        <w:numPr>
+          <w:ilvl w:val="0"/>
+          <w:numId w:val="5"/>
+        </w:numPr>
+        <w:spacing w:after="60" w:line="264"/>
+      </w:pPr>
+      <w:r>
+        <w:rPr>
+          <w:rFonts w:ascii="Arial" w:cs="Arial" w:eastAsia="Arial" w:hAnsi="Arial"/>
+          <w:b/>
+          <w:bCs/>
+          <w:color w:val="1A1A1A"/>
+        </w:rPr>
+        <w:t xml:space="preserve">Ground</w:t>
+      </w:r>
+      <w:r>
+        <w:rPr>
+          <w:rFonts w:ascii="Arial" w:cs="Arial" w:eastAsia="Arial" w:hAnsi="Arial"/>
+          <w:color w:val="1A1A1A"/>
+        </w:rPr>
+        <w:t xml:space="preserve">: the repository holds the context the agents need. That means architecture rules, module boundaries, coding conventions, the ADRs, and examples of approved patterns (e.g. how idempotent payment commands are written). Agents follow the codebase's standards rather than inventing their own.</w:t>
+      </w:r>
+    </w:p>
+    <w:p>
+      <w:pPr>
+        <w:pStyle w:val="ListParagraph"/>
+        <w:numPr>
+          <w:ilvl w:val="0"/>
+          <w:numId w:val="5"/>
+        </w:numPr>
+        <w:spacing w:after="60" w:line="264"/>
+      </w:pPr>
+      <w:r>
+        <w:rPr>
+          <w:rFonts w:ascii="Arial" w:cs="Arial" w:eastAsia="Arial" w:hAnsi="Arial"/>
+          <w:b/>
+          <w:bCs/>
+          <w:color w:val="1A1A1A"/>
+        </w:rPr>
+        <w:t xml:space="preserve">Generate</w:t>
+      </w:r>
+      <w:r>
+        <w:rPr>
+          <w:rFonts w:ascii="Arial" w:cs="Arial" w:eastAsia="Arial" w:hAnsi="Arial"/>
+          <w:color w:val="1A1A1A"/>
+        </w:rPr>
+        <w:t xml:space="preserve">: coding agents implement the spec across .NET, PostgreSQL migrations, React Native and React. They generate unit and API tests alongside the code and run the build and tests locally.</w:t>
+      </w:r>
+    </w:p>
+    <w:p>
+      <w:pPr>
+        <w:pStyle w:val="ListParagraph"/>
+        <w:numPr>
+          <w:ilvl w:val="0"/>
+          <w:numId w:val="5"/>
+        </w:numPr>
+        <w:spacing w:after="60" w:line="264"/>
+      </w:pPr>
+      <w:r>
+        <w:rPr>
+          <w:rFonts w:ascii="Arial" w:cs="Arial" w:eastAsia="Arial" w:hAnsi="Arial"/>
+          <w:b/>
+          <w:bCs/>
+          <w:color w:val="1A1A1A"/>
+        </w:rPr>
+        <w:t xml:space="preserve">Review &amp; harden</w:t>
+      </w:r>
+      <w:r>
+        <w:rPr>
+          <w:rFonts w:ascii="Arial" w:cs="Arial" w:eastAsia="Arial" w:hAnsi="Arial"/>
+          <w:color w:val="1A1A1A"/>
+        </w:rPr>
+        <w:t xml:space="preserve">: a senior engineer reviews the change, fixes design issues and edge cases, and owns the merge. AI provides a first-pass review; security-sensitive code gets a second human reviewer.</w:t>
+      </w:r>
+    </w:p>
+    <w:p>
+      <w:pPr>
+        <w:pStyle w:val="ListParagraph"/>
+        <w:numPr>
+          <w:ilvl w:val="0"/>
+          <w:numId w:val="5"/>
+        </w:numPr>
+        <w:spacing w:after="60" w:line="264"/>
+      </w:pPr>
+      <w:r>
+        <w:rPr>
+          <w:rFonts w:ascii="Arial" w:cs="Arial" w:eastAsia="Arial" w:hAnsi="Arial"/>
+          <w:b/>
+          <w:bCs/>
+          <w:color w:val="1A1A1A"/>
+        </w:rPr>
+        <w:t xml:space="preserve">Verify</w:t>
+      </w:r>
+      <w:r>
+        <w:rPr>
+          <w:rFonts w:ascii="Arial" w:cs="Arial" w:eastAsia="Arial" w:hAnsi="Arial"/>
+          <w:color w:val="1A1A1A"/>
+        </w:rPr>
+        <w:t xml:space="preserve">: CI runs the full gates: tests, coverage, architecture tests (module boundaries), SAST, dependency and secret scanning. QA extends the AI-generated regression and E2E suites.</w:t>
+      </w:r>
+    </w:p>
+    <w:p>
+      <w:pPr>
+        <w:pStyle w:val="ListParagraph"/>
+        <w:numPr>
+          <w:ilvl w:val="0"/>
+          <w:numId w:val="5"/>
+        </w:numPr>
+        <w:spacing w:after="60" w:line="264"/>
+      </w:pPr>
+      <w:r>
+        <w:rPr>
+          <w:rFonts w:ascii="Arial" w:cs="Arial" w:eastAsia="Arial" w:hAnsi="Arial"/>
+          <w:b/>
+          <w:bCs/>
+          <w:color w:val="1A1A1A"/>
+        </w:rPr>
+        <w:t xml:space="preserve">Document</w:t>
+      </w:r>
+      <w:r>
+        <w:rPr>
+          <w:rFonts w:ascii="Arial" w:cs="Arial" w:eastAsia="Arial" w:hAnsi="Arial"/>
+          <w:color w:val="1A1A1A"/>
+        </w:rPr>
+        <w:t xml:space="preserve">: API docs, Postman collections, ERDs and runbook sections are regenerated from the code and checked in the same pull request.</w:t>
+      </w:r>
+    </w:p>
+    <w:p>
+      <w:pPr>
+        <w:pStyle w:val="Heading2"/>
+        <w:keepNext/>
+      </w:pPr>
+      <w:r>
+        <w:t xml:space="preserve">9.2 Where AI makes the biggest difference on this programme</w:t>
+      </w:r>
+    </w:p>
+    <w:tbl>
+      <w:tblPr>
+        <w:tblW w:type="dxa" w:w="9638"/>
+        <w:tblBorders>
+          <w:top w:val="single" w:color="auto" w:sz="4"/>
+          <w:left w:val="single" w:color="auto" w:sz="4"/>
+          <w:bottom w:val="single" w:color="auto" w:sz="4"/>
+          <w:right w:val="single" w:color="auto" w:sz="4"/>
+          <w:insideH w:val="single" w:color="auto" w:sz="4"/>
+          <w:insideV w:val="single" w:color="auto" w:sz="4"/>
+        </w:tblBorders>
+      </w:tblPr>
+      <w:tblGrid>
+        <w:gridCol w:w="2313"/>
+        <w:gridCol w:w="4144"/>
+        <w:gridCol w:w="3181"/>
+      </w:tblGrid>
+      <w:tr>
+        <w:trPr>
+          <w:cantSplit/>
+          <w:tblHeader/>
+        </w:trPr>
+        <w:tc>
+          <w:tcPr>
+            <w:tcW w:type="dxa" w:w="2313"/>
+            <w:tcBorders>
+              <w:top w:val="single" w:color="C9CED8" w:sz="4"/>
+              <w:left w:val="single" w:color="C9CED8" w:sz="4"/>
+              <w:bottom w:val="single" w:color="C9CED8" w:sz="4"/>
+              <w:right w:val="single" w:color="C9CED8" w:sz="4"/>
+            </w:tcBorders>
+            <w:shd w:fill="1F3864" w:color="auto" w:val="clear"/>
+            <w:tcMar>
+              <w:top w:type="dxa" w:w="60"/>
+              <w:left w:type="dxa" w:w="90"/>
+              <w:bottom w:type="dxa" w:w="60"/>
+              <w:right w:type="dxa" w:w="90"/>
+            </w:tcMar>
+            <w:vAlign w:val="top"/>
+          </w:tcPr>
+          <w:p>
+            <w:pPr>
+              <w:spacing w:after="20" w:line="250"/>
+            </w:pPr>
+            <w:r>
+              <w:rPr>
+                <w:rFonts w:ascii="Arial" w:cs="Arial" w:eastAsia="Arial" w:hAnsi="Arial"/>
+                <w:b/>
+                <w:bCs/>
+                <w:color w:val="FFFFFF"/>
+                <w:sz w:val="17"/>
+                <w:szCs w:val="17"/>
+              </w:rPr>
+              <w:t xml:space="preserve">Area</w:t>
+            </w:r>
+          </w:p>
+        </w:tc>
+        <w:tc>
+          <w:tcPr>
+            <w:tcW w:type="dxa" w:w="4144"/>
+            <w:tcBorders>
+              <w:top w:val="single" w:color="C9CED8" w:sz="4"/>
+              <w:left w:val="single" w:color="C9CED8" w:sz="4"/>
+              <w:bottom w:val="single" w:color="C9CED8" w:sz="4"/>
+              <w:right w:val="single" w:color="C9CED8" w:sz="4"/>
+            </w:tcBorders>
+            <w:shd w:fill="1F3864" w:color="auto" w:val="clear"/>
+            <w:tcMar>
+              <w:top w:type="dxa" w:w="60"/>
+              <w:left w:type="dxa" w:w="90"/>
+              <w:bottom w:type="dxa" w:w="60"/>
+              <w:right w:type="dxa" w:w="90"/>
+            </w:tcMar>
+            <w:vAlign w:val="top"/>
+          </w:tcPr>
+          <w:p>
+            <w:pPr>
+              <w:spacing w:after="20" w:line="250"/>
+            </w:pPr>
+            <w:r>
+              <w:rPr>
+                <w:rFonts w:ascii="Arial" w:cs="Arial" w:eastAsia="Arial" w:hAnsi="Arial"/>
+                <w:b/>
+                <w:bCs/>
+                <w:color w:val="FFFFFF"/>
+                <w:sz w:val="17"/>
+                <w:szCs w:val="17"/>
+              </w:rPr>
+              <w:t xml:space="preserve">AI contribution</w:t>
+            </w:r>
+          </w:p>
+        </w:tc>
+        <w:tc>
+          <w:tcPr>
+            <w:tcW w:type="dxa" w:w="3181"/>
+            <w:tcBorders>
+              <w:top w:val="single" w:color="C9CED8" w:sz="4"/>
+              <w:left w:val="single" w:color="C9CED8" w:sz="4"/>
+              <w:bottom w:val="single" w:color="C9CED8" w:sz="4"/>
+              <w:right w:val="single" w:color="C9CED8" w:sz="4"/>
+            </w:tcBorders>
+            <w:shd w:fill="1F3864" w:color="auto" w:val="clear"/>
+            <w:tcMar>
+              <w:top w:type="dxa" w:w="60"/>
+              <w:left w:type="dxa" w:w="90"/>
+              <w:bottom w:type="dxa" w:w="60"/>
+              <w:right w:type="dxa" w:w="90"/>
+            </w:tcMar>
+            <w:vAlign w:val="top"/>
+          </w:tcPr>
+          <w:p>
+            <w:pPr>
+              <w:spacing w:after="20" w:line="250"/>
+            </w:pPr>
+            <w:r>
+              <w:rPr>
+                <w:rFonts w:ascii="Arial" w:cs="Arial" w:eastAsia="Arial" w:hAnsi="Arial"/>
+                <w:b/>
+                <w:bCs/>
+                <w:color w:val="FFFFFF"/>
+                <w:sz w:val="17"/>
+                <w:szCs w:val="17"/>
+              </w:rPr>
+              <w:t xml:space="preserve">Human responsibility</w:t>
+            </w:r>
+          </w:p>
+        </w:tc>
+      </w:tr>
+      <w:tr>
+        <w:trPr>
+          <w:cantSplit/>
+        </w:trPr>
+        <w:tc>
+          <w:tcPr>
+            <w:tcW w:type="dxa" w:w="2313"/>
+            <w:tcBorders>
+              <w:top w:val="single" w:color="C9CED8" w:sz="4"/>
+              <w:left w:val="single" w:color="C9CED8" w:sz="4"/>
+              <w:bottom w:val="single" w:color="C9CED8" w:sz="4"/>
+              <w:right w:val="single" w:color="C9CED8" w:sz="4"/>
+            </w:tcBorders>
+            <w:tcMar>
+              <w:top w:type="dxa" w:w="60"/>
+              <w:left w:type="dxa" w:w="90"/>
+              <w:bottom w:type="dxa" w:w="60"/>
+              <w:right w:type="dxa" w:w="90"/>
+            </w:tcMar>
+            <w:vAlign w:val="top"/>
+          </w:tcPr>
+          <w:p>
+            <w:pPr>
+              <w:spacing w:after="20" w:line="250"/>
+            </w:pPr>
+            <w:r>
+              <w:rPr>
+                <w:rFonts w:ascii="Arial" w:cs="Arial" w:eastAsia="Arial" w:hAnsi="Arial"/>
+                <w:color w:val="1A1A1A"/>
+                <w:sz w:val="17"/>
+                <w:szCs w:val="17"/>
+              </w:rPr>
+              <w:t xml:space="preserve">Phase 1 understanding</w:t>
+            </w:r>
+          </w:p>
+        </w:tc>
+        <w:tc>
+          <w:tcPr>
+            <w:tcW w:type="dxa" w:w="4144"/>
+            <w:tcBorders>
+              <w:top w:val="single" w:color="C9CED8" w:sz="4"/>
+              <w:left w:val="single" w:color="C9CED8" w:sz="4"/>
+              <w:bottom w:val="single" w:color="C9CED8" w:sz="4"/>
+              <w:right w:val="single" w:color="C9CED8" w:sz="4"/>
+            </w:tcBorders>
+            <w:tcMar>
+              <w:top w:type="dxa" w:w="60"/>
+              <w:left w:type="dxa" w:w="90"/>
+              <w:bottom w:type="dxa" w:w="60"/>
+              <w:right w:type="dxa" w:w="90"/>
+            </w:tcMar>
+            <w:vAlign w:val="top"/>
+          </w:tcPr>
+          <w:p>
+            <w:pPr>
+              <w:spacing w:after="20" w:line="250"/>
+            </w:pPr>
+            <w:r>
+              <w:rPr>
+                <w:rFonts w:ascii="Arial" w:cs="Arial" w:eastAsia="Arial" w:hAnsi="Arial"/>
+                <w:color w:val="1A1A1A"/>
+                <w:sz w:val="17"/>
+                <w:szCs w:val="17"/>
+              </w:rPr>
+              <w:t xml:space="preserve">Maps the live .NET / React Native / PostgreSQL code in days: architecture, ERD, API catalogue, risk hotspots</w:t>
+            </w:r>
+          </w:p>
+        </w:tc>
+        <w:tc>
+          <w:tcPr>
+            <w:tcW w:type="dxa" w:w="3181"/>
+            <w:tcBorders>
+              <w:top w:val="single" w:color="C9CED8" w:sz="4"/>
+              <w:left w:val="single" w:color="C9CED8" w:sz="4"/>
+              <w:bottom w:val="single" w:color="C9CED8" w:sz="4"/>
+              <w:right w:val="single" w:color="C9CED8" w:sz="4"/>
+            </w:tcBorders>
+            <w:tcMar>
+              <w:top w:type="dxa" w:w="60"/>
+              <w:left w:type="dxa" w:w="90"/>
+              <w:bottom w:type="dxa" w:w="60"/>
+              <w:right w:type="dxa" w:w="90"/>
+            </w:tcMar>
+            <w:vAlign w:val="top"/>
+          </w:tcPr>
+          <w:p>
+            <w:pPr>
+              <w:spacing w:after="20" w:line="250"/>
+            </w:pPr>
+            <w:r>
+              <w:rPr>
+                <w:rFonts w:ascii="Arial" w:cs="Arial" w:eastAsia="Arial" w:hAnsi="Arial"/>
+                <w:color w:val="1A1A1A"/>
+                <w:sz w:val="17"/>
+                <w:szCs w:val="17"/>
+              </w:rPr>
+              <w:t xml:space="preserve">Architect validates and decides what to trust</w:t>
+            </w:r>
+          </w:p>
+        </w:tc>
+      </w:tr>
+      <w:tr>
+        <w:trPr>
+          <w:cantSplit/>
+        </w:trPr>
+        <w:tc>
+          <w:tcPr>
+            <w:tcW w:type="dxa" w:w="2313"/>
+            <w:tcBorders>
+              <w:top w:val="single" w:color="C9CED8" w:sz="4"/>
+              <w:left w:val="single" w:color="C9CED8" w:sz="4"/>
+              <w:bottom w:val="single" w:color="C9CED8" w:sz="4"/>
+              <w:right w:val="single" w:color="C9CED8" w:sz="4"/>
+            </w:tcBorders>
+            <w:shd w:fill="F3F5F9" w:color="auto" w:val="clear"/>
+            <w:tcMar>
+              <w:top w:type="dxa" w:w="60"/>
+              <w:left w:type="dxa" w:w="90"/>
+              <w:bottom w:type="dxa" w:w="60"/>
+              <w:right w:type="dxa" w:w="90"/>
+            </w:tcMar>
+            <w:vAlign w:val="top"/>
+          </w:tcPr>
+          <w:p>
+            <w:pPr>
+              <w:spacing w:after="20" w:line="250"/>
+            </w:pPr>
+            <w:r>
+              <w:rPr>
+                <w:rFonts w:ascii="Arial" w:cs="Arial" w:eastAsia="Arial" w:hAnsi="Arial"/>
+                <w:color w:val="1A1A1A"/>
+                <w:sz w:val="17"/>
+                <w:szCs w:val="17"/>
+              </w:rPr>
+              <w:t xml:space="preserve">Web application (F6, F10)</w:t>
+            </w:r>
+          </w:p>
+        </w:tc>
+        <w:tc>
+          <w:tcPr>
+            <w:tcW w:type="dxa" w:w="4144"/>
+            <w:tcBorders>
+              <w:top w:val="single" w:color="C9CED8" w:sz="4"/>
+              <w:left w:val="single" w:color="C9CED8" w:sz="4"/>
+              <w:bottom w:val="single" w:color="C9CED8" w:sz="4"/>
+              <w:right w:val="single" w:color="C9CED8" w:sz="4"/>
+            </w:tcBorders>
+            <w:shd w:fill="F3F5F9" w:color="auto" w:val="clear"/>
+            <w:tcMar>
+              <w:top w:type="dxa" w:w="60"/>
+              <w:left w:type="dxa" w:w="90"/>
+              <w:bottom w:type="dxa" w:w="60"/>
+              <w:right w:type="dxa" w:w="90"/>
+            </w:tcMar>
+            <w:vAlign w:val="top"/>
+          </w:tcPr>
+          <w:p>
+            <w:pPr>
+              <w:spacing w:after="20" w:line="250"/>
+            </w:pPr>
+            <w:r>
+              <w:rPr>
+                <w:rFonts w:ascii="Arial" w:cs="Arial" w:eastAsia="Arial" w:hAnsi="Arial"/>
+                <w:color w:val="1A1A1A"/>
+                <w:sz w:val="17"/>
+                <w:szCs w:val="17"/>
+              </w:rPr>
+              <w:t xml:space="preserve">Ports existing mobile journeys to React/Next.js against the same APIs, reusing design tokens and generating parity checks</w:t>
+            </w:r>
+          </w:p>
+        </w:tc>
+        <w:tc>
+          <w:tcPr>
+            <w:tcW w:type="dxa" w:w="3181"/>
+            <w:tcBorders>
+              <w:top w:val="single" w:color="C9CED8" w:sz="4"/>
+              <w:left w:val="single" w:color="C9CED8" w:sz="4"/>
+              <w:bottom w:val="single" w:color="C9CED8" w:sz="4"/>
+              <w:right w:val="single" w:color="C9CED8" w:sz="4"/>
+            </w:tcBorders>
+            <w:shd w:fill="F3F5F9" w:color="auto" w:val="clear"/>
+            <w:tcMar>
+              <w:top w:type="dxa" w:w="60"/>
+              <w:left w:type="dxa" w:w="90"/>
+              <w:bottom w:type="dxa" w:w="60"/>
+              <w:right w:type="dxa" w:w="90"/>
+            </w:tcMar>
+            <w:vAlign w:val="top"/>
+          </w:tcPr>
+          <w:p>
+            <w:pPr>
+              <w:spacing w:after="20" w:line="250"/>
+            </w:pPr>
+            <w:r>
+              <w:rPr>
+                <w:rFonts w:ascii="Arial" w:cs="Arial" w:eastAsia="Arial" w:hAnsi="Arial"/>
+                <w:color w:val="1A1A1A"/>
+                <w:sz w:val="17"/>
+                <w:szCs w:val="17"/>
+              </w:rPr>
+              <w:t xml:space="preserve">Web engineer owns UX quality, SEO, accessibility</w:t>
+            </w:r>
+          </w:p>
+        </w:tc>
+      </w:tr>
+      <w:tr>
+        <w:trPr>
+          <w:cantSplit/>
+        </w:trPr>
+        <w:tc>
+          <w:tcPr>
+            <w:tcW w:type="dxa" w:w="2313"/>
+            <w:tcBorders>
+              <w:top w:val="single" w:color="C9CED8" w:sz="4"/>
+              <w:left w:val="single" w:color="C9CED8" w:sz="4"/>
+              <w:bottom w:val="single" w:color="C9CED8" w:sz="4"/>
+              <w:right w:val="single" w:color="C9CED8" w:sz="4"/>
+            </w:tcBorders>
+            <w:tcMar>
+              <w:top w:type="dxa" w:w="60"/>
+              <w:left w:type="dxa" w:w="90"/>
+              <w:bottom w:type="dxa" w:w="60"/>
+              <w:right w:type="dxa" w:w="90"/>
+            </w:tcMar>
+            <w:vAlign w:val="top"/>
+          </w:tcPr>
+          <w:p>
+            <w:pPr>
+              <w:spacing w:after="20" w:line="250"/>
+            </w:pPr>
+            <w:r>
+              <w:rPr>
+                <w:rFonts w:ascii="Arial" w:cs="Arial" w:eastAsia="Arial" w:hAnsi="Arial"/>
+                <w:color w:val="1A1A1A"/>
+                <w:sz w:val="17"/>
+                <w:szCs w:val="17"/>
+              </w:rPr>
+              <w:t xml:space="preserve">Regression safety net</w:t>
+            </w:r>
+          </w:p>
+        </w:tc>
+        <w:tc>
+          <w:tcPr>
+            <w:tcW w:type="dxa" w:w="4144"/>
+            <w:tcBorders>
+              <w:top w:val="single" w:color="C9CED8" w:sz="4"/>
+              <w:left w:val="single" w:color="C9CED8" w:sz="4"/>
+              <w:bottom w:val="single" w:color="C9CED8" w:sz="4"/>
+              <w:right w:val="single" w:color="C9CED8" w:sz="4"/>
+            </w:tcBorders>
+            <w:tcMar>
+              <w:top w:type="dxa" w:w="60"/>
+              <w:left w:type="dxa" w:w="90"/>
+              <w:bottom w:type="dxa" w:w="60"/>
+              <w:right w:type="dxa" w:w="90"/>
+            </w:tcMar>
+            <w:vAlign w:val="top"/>
+          </w:tcPr>
+          <w:p>
+            <w:pPr>
+              <w:spacing w:after="20" w:line="250"/>
+            </w:pPr>
+            <w:r>
+              <w:rPr>
+                <w:rFonts w:ascii="Arial" w:cs="Arial" w:eastAsia="Arial" w:hAnsi="Arial"/>
+                <w:color w:val="1A1A1A"/>
+                <w:sz w:val="17"/>
+                <w:szCs w:val="17"/>
+              </w:rPr>
+              <w:t xml:space="preserve">Generates and extends suites for every live journey, so the monthly train stays safe as scope grows</w:t>
+            </w:r>
+          </w:p>
+        </w:tc>
+        <w:tc>
+          <w:tcPr>
+            <w:tcW w:type="dxa" w:w="3181"/>
+            <w:tcBorders>
+              <w:top w:val="single" w:color="C9CED8" w:sz="4"/>
+              <w:left w:val="single" w:color="C9CED8" w:sz="4"/>
+              <w:bottom w:val="single" w:color="C9CED8" w:sz="4"/>
+              <w:right w:val="single" w:color="C9CED8" w:sz="4"/>
+            </w:tcBorders>
+            <w:tcMar>
+              <w:top w:type="dxa" w:w="60"/>
+              <w:left w:type="dxa" w:w="90"/>
+              <w:bottom w:type="dxa" w:w="60"/>
+              <w:right w:type="dxa" w:w="90"/>
+            </w:tcMar>
+            <w:vAlign w:val="top"/>
+          </w:tcPr>
+          <w:p>
+            <w:pPr>
+              <w:spacing w:after="20" w:line="250"/>
+            </w:pPr>
+            <w:r>
+              <w:rPr>
+                <w:rFonts w:ascii="Arial" w:cs="Arial" w:eastAsia="Arial" w:hAnsi="Arial"/>
+                <w:color w:val="1A1A1A"/>
+                <w:sz w:val="17"/>
+                <w:szCs w:val="17"/>
+              </w:rPr>
+              <w:t xml:space="preserve">QA curates, removes flaky tests, adds exploratory tests</w:t>
+            </w:r>
+          </w:p>
+        </w:tc>
+      </w:tr>
+      <w:tr>
+        <w:trPr>
+          <w:cantSplit/>
+        </w:trPr>
+        <w:tc>
+          <w:tcPr>
+            <w:tcW w:type="dxa" w:w="2313"/>
+            <w:tcBorders>
+              <w:top w:val="single" w:color="C9CED8" w:sz="4"/>
+              <w:left w:val="single" w:color="C9CED8" w:sz="4"/>
+              <w:bottom w:val="single" w:color="C9CED8" w:sz="4"/>
+              <w:right w:val="single" w:color="C9CED8" w:sz="4"/>
+            </w:tcBorders>
+            <w:shd w:fill="F3F5F9" w:color="auto" w:val="clear"/>
+            <w:tcMar>
+              <w:top w:type="dxa" w:w="60"/>
+              <w:left w:type="dxa" w:w="90"/>
+              <w:bottom w:type="dxa" w:w="60"/>
+              <w:right w:type="dxa" w:w="90"/>
+            </w:tcMar>
+            <w:vAlign w:val="top"/>
+          </w:tcPr>
+          <w:p>
+            <w:pPr>
+              <w:spacing w:after="20" w:line="250"/>
+            </w:pPr>
+            <w:r>
+              <w:rPr>
+                <w:rFonts w:ascii="Arial" w:cs="Arial" w:eastAsia="Arial" w:hAnsi="Arial"/>
+                <w:color w:val="1A1A1A"/>
+                <w:sz w:val="17"/>
+                <w:szCs w:val="17"/>
+              </w:rPr>
+              <w:t xml:space="preserve">Identity &amp; data migration (F3)</w:t>
+            </w:r>
+          </w:p>
+        </w:tc>
+        <w:tc>
+          <w:tcPr>
+            <w:tcW w:type="dxa" w:w="4144"/>
+            <w:tcBorders>
+              <w:top w:val="single" w:color="C9CED8" w:sz="4"/>
+              <w:left w:val="single" w:color="C9CED8" w:sz="4"/>
+              <w:bottom w:val="single" w:color="C9CED8" w:sz="4"/>
+              <w:right w:val="single" w:color="C9CED8" w:sz="4"/>
+            </w:tcBorders>
+            <w:shd w:fill="F3F5F9" w:color="auto" w:val="clear"/>
+            <w:tcMar>
+              <w:top w:type="dxa" w:w="60"/>
+              <w:left w:type="dxa" w:w="90"/>
+              <w:bottom w:type="dxa" w:w="60"/>
+              <w:right w:type="dxa" w:w="90"/>
+            </w:tcMar>
+            <w:vAlign w:val="top"/>
+          </w:tcPr>
+          <w:p>
+            <w:pPr>
+              <w:spacing w:after="20" w:line="250"/>
+            </w:pPr>
+            <w:r>
+              <w:rPr>
+                <w:rFonts w:ascii="Arial" w:cs="Arial" w:eastAsia="Arial" w:hAnsi="Arial"/>
+                <w:color w:val="1A1A1A"/>
+                <w:sz w:val="17"/>
+                <w:szCs w:val="17"/>
+              </w:rPr>
+              <w:t xml:space="preserve">Drafts duplicate-detection queries, merge scripts and reconciliation reports</w:t>
+            </w:r>
+          </w:p>
+        </w:tc>
+        <w:tc>
+          <w:tcPr>
+            <w:tcW w:type="dxa" w:w="3181"/>
+            <w:tcBorders>
+              <w:top w:val="single" w:color="C9CED8" w:sz="4"/>
+              <w:left w:val="single" w:color="C9CED8" w:sz="4"/>
+              <w:bottom w:val="single" w:color="C9CED8" w:sz="4"/>
+              <w:right w:val="single" w:color="C9CED8" w:sz="4"/>
+            </w:tcBorders>
+            <w:shd w:fill="F3F5F9" w:color="auto" w:val="clear"/>
+            <w:tcMar>
+              <w:top w:type="dxa" w:w="60"/>
+              <w:left w:type="dxa" w:w="90"/>
+              <w:bottom w:type="dxa" w:w="60"/>
+              <w:right w:type="dxa" w:w="90"/>
+            </w:tcMar>
+            <w:vAlign w:val="top"/>
+          </w:tcPr>
+          <w:p>
+            <w:pPr>
+              <w:spacing w:after="20" w:line="250"/>
+            </w:pPr>
+            <w:r>
+              <w:rPr>
+                <w:rFonts w:ascii="Arial" w:cs="Arial" w:eastAsia="Arial" w:hAnsi="Arial"/>
+                <w:color w:val="1A1A1A"/>
+                <w:sz w:val="17"/>
+                <w:szCs w:val="17"/>
+              </w:rPr>
+              <w:t xml:space="preserve">Engineers verify on Testcontainers and Staging; SportSeek approves merge rules</w:t>
+            </w:r>
+          </w:p>
+        </w:tc>
+      </w:tr>
+      <w:tr>
+        <w:trPr>
+          <w:cantSplit/>
+        </w:trPr>
+        <w:tc>
+          <w:tcPr>
+            <w:tcW w:type="dxa" w:w="2313"/>
+            <w:tcBorders>
+              <w:top w:val="single" w:color="C9CED8" w:sz="4"/>
+              <w:left w:val="single" w:color="C9CED8" w:sz="4"/>
+              <w:bottom w:val="single" w:color="C9CED8" w:sz="4"/>
+              <w:right w:val="single" w:color="C9CED8" w:sz="4"/>
+            </w:tcBorders>
+            <w:tcMar>
+              <w:top w:type="dxa" w:w="60"/>
+              <w:left w:type="dxa" w:w="90"/>
+              <w:bottom w:type="dxa" w:w="60"/>
+              <w:right w:type="dxa" w:w="90"/>
+            </w:tcMar>
+            <w:vAlign w:val="top"/>
+          </w:tcPr>
+          <w:p>
+            <w:pPr>
+              <w:spacing w:after="20" w:line="250"/>
+            </w:pPr>
+            <w:r>
+              <w:rPr>
+                <w:rFonts w:ascii="Arial" w:cs="Arial" w:eastAsia="Arial" w:hAnsi="Arial"/>
+                <w:color w:val="1A1A1A"/>
+                <w:sz w:val="17"/>
+                <w:szCs w:val="17"/>
+              </w:rPr>
+              <w:t xml:space="preserve">Integrations</w:t>
+            </w:r>
+          </w:p>
+        </w:tc>
+        <w:tc>
+          <w:tcPr>
+            <w:tcW w:type="dxa" w:w="4144"/>
+            <w:tcBorders>
+              <w:top w:val="single" w:color="C9CED8" w:sz="4"/>
+              <w:left w:val="single" w:color="C9CED8" w:sz="4"/>
+              <w:bottom w:val="single" w:color="C9CED8" w:sz="4"/>
+              <w:right w:val="single" w:color="C9CED8" w:sz="4"/>
+            </w:tcBorders>
+            <w:tcMar>
+              <w:top w:type="dxa" w:w="60"/>
+              <w:left w:type="dxa" w:w="90"/>
+              <w:bottom w:type="dxa" w:w="60"/>
+              <w:right w:type="dxa" w:w="90"/>
+            </w:tcMar>
+            <w:vAlign w:val="top"/>
+          </w:tcPr>
+          <w:p>
+            <w:pPr>
+              <w:spacing w:after="20" w:line="250"/>
+            </w:pPr>
+            <w:r>
+              <w:rPr>
+                <w:rFonts w:ascii="Arial" w:cs="Arial" w:eastAsia="Arial" w:hAnsi="Arial"/>
+                <w:color w:val="1A1A1A"/>
+                <w:sz w:val="17"/>
+                <w:szCs w:val="17"/>
+              </w:rPr>
+              <w:t xml:space="preserve">Scaffolds adapters for Razorpay, SMS, WhatsApp BSP, FCM/APNs and email from provider documentation</w:t>
+            </w:r>
+          </w:p>
+        </w:tc>
+        <w:tc>
+          <w:tcPr>
+            <w:tcW w:type="dxa" w:w="3181"/>
+            <w:tcBorders>
+              <w:top w:val="single" w:color="C9CED8" w:sz="4"/>
+              <w:left w:val="single" w:color="C9CED8" w:sz="4"/>
+              <w:bottom w:val="single" w:color="C9CED8" w:sz="4"/>
+              <w:right w:val="single" w:color="C9CED8" w:sz="4"/>
+            </w:tcBorders>
+            <w:tcMar>
+              <w:top w:type="dxa" w:w="60"/>
+              <w:left w:type="dxa" w:w="90"/>
+              <w:bottom w:type="dxa" w:w="60"/>
+              <w:right w:type="dxa" w:w="90"/>
+            </w:tcMar>
+            <w:vAlign w:val="top"/>
+          </w:tcPr>
+          <w:p>
+            <w:pPr>
+              <w:spacing w:after="20" w:line="250"/>
+            </w:pPr>
+            <w:r>
+              <w:rPr>
+                <w:rFonts w:ascii="Arial" w:cs="Arial" w:eastAsia="Arial" w:hAnsi="Arial"/>
+                <w:color w:val="1A1A1A"/>
+                <w:sz w:val="17"/>
+                <w:szCs w:val="17"/>
+              </w:rPr>
+              <w:t xml:space="preserve">Engineers validate against sandboxes; webhook security reviewed by the architect</w:t>
+            </w:r>
+          </w:p>
+        </w:tc>
+      </w:tr>
+      <w:tr>
+        <w:trPr>
+          <w:cantSplit/>
+        </w:trPr>
+        <w:tc>
+          <w:tcPr>
+            <w:tcW w:type="dxa" w:w="2313"/>
+            <w:tcBorders>
+              <w:top w:val="single" w:color="C9CED8" w:sz="4"/>
+              <w:left w:val="single" w:color="C9CED8" w:sz="4"/>
+              <w:bottom w:val="single" w:color="C9CED8" w:sz="4"/>
+              <w:right w:val="single" w:color="C9CED8" w:sz="4"/>
+            </w:tcBorders>
+            <w:shd w:fill="F3F5F9" w:color="auto" w:val="clear"/>
+            <w:tcMar>
+              <w:top w:type="dxa" w:w="60"/>
+              <w:left w:type="dxa" w:w="90"/>
+              <w:bottom w:type="dxa" w:w="60"/>
+              <w:right w:type="dxa" w:w="90"/>
+            </w:tcMar>
+            <w:vAlign w:val="top"/>
+          </w:tcPr>
+          <w:p>
+            <w:pPr>
+              <w:spacing w:after="20" w:line="250"/>
+            </w:pPr>
+            <w:r>
+              <w:rPr>
+                <w:rFonts w:ascii="Arial" w:cs="Arial" w:eastAsia="Arial" w:hAnsi="Arial"/>
+                <w:color w:val="1A1A1A"/>
+                <w:sz w:val="17"/>
+                <w:szCs w:val="17"/>
+              </w:rPr>
+              <w:t xml:space="preserve">Documentation &amp; KT</w:t>
+            </w:r>
+          </w:p>
+        </w:tc>
+        <w:tc>
+          <w:tcPr>
+            <w:tcW w:type="dxa" w:w="4144"/>
+            <w:tcBorders>
+              <w:top w:val="single" w:color="C9CED8" w:sz="4"/>
+              <w:left w:val="single" w:color="C9CED8" w:sz="4"/>
+              <w:bottom w:val="single" w:color="C9CED8" w:sz="4"/>
+              <w:right w:val="single" w:color="C9CED8" w:sz="4"/>
+            </w:tcBorders>
+            <w:shd w:fill="F3F5F9" w:color="auto" w:val="clear"/>
+            <w:tcMar>
+              <w:top w:type="dxa" w:w="60"/>
+              <w:left w:type="dxa" w:w="90"/>
+              <w:bottom w:type="dxa" w:w="60"/>
+              <w:right w:type="dxa" w:w="90"/>
+            </w:tcMar>
+            <w:vAlign w:val="top"/>
+          </w:tcPr>
+          <w:p>
+            <w:pPr>
+              <w:spacing w:after="20" w:line="250"/>
+            </w:pPr>
+            <w:r>
+              <w:rPr>
+                <w:rFonts w:ascii="Arial" w:cs="Arial" w:eastAsia="Arial" w:hAnsi="Arial"/>
+                <w:color w:val="1A1A1A"/>
+                <w:sz w:val="17"/>
+                <w:szCs w:val="17"/>
+              </w:rPr>
+              <w:t xml:space="preserve">Keeps HLD/LLD, API docs and runbooks current; answers questions over the codebase</w:t>
+            </w:r>
+          </w:p>
+        </w:tc>
+        <w:tc>
+          <w:tcPr>
+            <w:tcW w:type="dxa" w:w="3181"/>
+            <w:tcBorders>
+              <w:top w:val="single" w:color="C9CED8" w:sz="4"/>
+              <w:left w:val="single" w:color="C9CED8" w:sz="4"/>
+              <w:bottom w:val="single" w:color="C9CED8" w:sz="4"/>
+              <w:right w:val="single" w:color="C9CED8" w:sz="4"/>
+            </w:tcBorders>
+            <w:shd w:fill="F3F5F9" w:color="auto" w:val="clear"/>
+            <w:tcMar>
+              <w:top w:type="dxa" w:w="60"/>
+              <w:left w:type="dxa" w:w="90"/>
+              <w:bottom w:type="dxa" w:w="60"/>
+              <w:right w:type="dxa" w:w="90"/>
+            </w:tcMar>
+            <w:vAlign w:val="top"/>
+          </w:tcPr>
+          <w:p>
+            <w:pPr>
+              <w:spacing w:after="20" w:line="250"/>
+            </w:pPr>
+            <w:r>
+              <w:rPr>
+                <w:rFonts w:ascii="Arial" w:cs="Arial" w:eastAsia="Arial" w:hAnsi="Arial"/>
+                <w:color w:val="1A1A1A"/>
+                <w:sz w:val="17"/>
+                <w:szCs w:val="17"/>
+              </w:rPr>
+              <w:t xml:space="preserve">Architect reviews; SportSeek signs KT checklist</w:t>
+            </w:r>
+          </w:p>
+        </w:tc>
+      </w:tr>
+    </w:tbl>
+    <w:p>
+      <w:pPr>
+        <w:spacing w:after="140"/>
+      </w:pPr>
+    </w:p>
+    <w:p>
+      <w:pPr>
+        <w:pStyle w:val="Heading2"/>
+        <w:keepNext/>
+      </w:pPr>
+      <w:r>
+        <w:t xml:space="preserve">9.3 Guardrails</w:t>
+      </w:r>
+    </w:p>
+    <w:p>
+      <w:pPr>
+        <w:pStyle w:val="ListParagraph"/>
+        <w:numPr>
+          <w:ilvl w:val="0"/>
+          <w:numId w:val="3"/>
+        </w:numPr>
+        <w:spacing w:after="60" w:line="264"/>
+      </w:pPr>
+      <w:r>
+        <w:rPr>
+          <w:rFonts w:ascii="Arial" w:cs="Arial" w:eastAsia="Arial" w:hAnsi="Arial"/>
+          <w:color w:val="1A1A1A"/>
+        </w:rPr>
+        <w:t xml:space="preserve">Enterprise-terms AI tools only, approved by SportSeek; no training on SportSeek code or data.</w:t>
+      </w:r>
+    </w:p>
+    <w:p>
+      <w:pPr>
+        <w:pStyle w:val="ListParagraph"/>
+        <w:numPr>
+          <w:ilvl w:val="0"/>
+          <w:numId w:val="3"/>
+        </w:numPr>
+        <w:spacing w:after="60" w:line="264"/>
+      </w:pPr>
+      <w:r>
+        <w:rPr>
+          <w:rFonts w:ascii="Arial" w:cs="Arial" w:eastAsia="Arial" w:hAnsi="Arial"/>
+          <w:color w:val="1A1A1A"/>
+        </w:rPr>
+        <w:t xml:space="preserve">No production data or secrets in agent context; agents have no production access and cannot deploy.</w:t>
+      </w:r>
+    </w:p>
+    <w:p>
+      <w:pPr>
+        <w:pStyle w:val="ListParagraph"/>
+        <w:numPr>
+          <w:ilvl w:val="0"/>
+          <w:numId w:val="3"/>
+        </w:numPr>
+        <w:spacing w:after="60" w:line="264"/>
+      </w:pPr>
+      <w:r>
+        <w:rPr>
+          <w:rFonts w:ascii="Arial" w:cs="Arial" w:eastAsia="Arial" w:hAnsi="Arial"/>
+          <w:color w:val="1A1A1A"/>
+        </w:rPr>
+        <w:t xml:space="preserve">Every merge has a named human reviewer who can explain the change; two reviewers for identity, payments, refunds, payouts and KYC.</w:t>
+      </w:r>
+    </w:p>
+    <w:p>
+      <w:pPr>
+        <w:pStyle w:val="ListParagraph"/>
+        <w:numPr>
+          <w:ilvl w:val="0"/>
+          <w:numId w:val="3"/>
+        </w:numPr>
+        <w:spacing w:after="60" w:line="264"/>
+      </w:pPr>
+      <w:r>
+        <w:rPr>
+          <w:rFonts w:ascii="Arial" w:cs="Arial" w:eastAsia="Arial" w:hAnsi="Arial"/>
+          <w:color w:val="1A1A1A"/>
+        </w:rPr>
+        <w:t xml:space="preserve">Same quality and security gates for all code, however it was produced; generated dependencies are licence-checked.</w:t>
+      </w:r>
+    </w:p>
+    <w:p>
+      <w:pPr>
+        <w:pStyle w:val="ListParagraph"/>
+        <w:numPr>
+          <w:ilvl w:val="0"/>
+          <w:numId w:val="3"/>
+        </w:numPr>
+        <w:spacing w:after="60" w:line="264"/>
+      </w:pPr>
+      <w:r>
+        <w:rPr>
+          <w:rFonts w:ascii="Arial" w:cs="Arial" w:eastAsia="Arial" w:hAnsi="Arial"/>
+          <w:color w:val="1A1A1A"/>
+        </w:rPr>
+        <w:t xml:space="preserve">AI assistance is recorded in pull requests and reported monthly (share of AI-assisted changes, review time, rework rate).</w:t>
+      </w:r>
+    </w:p>
+    <w:p>
+      <w:pPr>
+        <w:pStyle w:val="Heading1"/>
+        <w:pageBreakBefore/>
+      </w:pPr>
+      <w:r>
+        <w:t xml:space="preserve">10. Technical plan for the 20 October 2026 launch</w:t>
+      </w:r>
+    </w:p>
+    <w:p>
+      <w:pPr>
+        <w:spacing w:after="120" w:line="276"/>
+      </w:pPr>
+      <w:r>
+        <w:rPr>
+          <w:rFonts w:ascii="Arial" w:cs="Arial" w:eastAsia="Arial" w:hAnsi="Arial"/>
+          <w:color w:val="1A1A1A"/>
+        </w:rPr>
+        <w:t xml:space="preserve">For launch we deliberately avoid changes to identity, payments or the data model. The work makes the existing system safe, visible and recoverable under public load, and adds two back-end-led features that carry little risk: </w:t>
+      </w:r>
+      <w:r>
+        <w:rPr>
+          <w:rFonts w:ascii="Arial" w:cs="Arial" w:eastAsia="Arial" w:hAnsi="Arial"/>
+          <w:b/>
+          <w:bCs/>
+          <w:color w:val="1A1A1A"/>
+        </w:rPr>
+        <w:t xml:space="preserve">F1 Email notifications</w:t>
+      </w:r>
+      <w:r>
+        <w:rPr>
+          <w:rFonts w:ascii="Arial" w:cs="Arial" w:eastAsia="Arial" w:hAnsi="Arial"/>
+          <w:color w:val="1A1A1A"/>
+        </w:rPr>
+        <w:t xml:space="preserve"> for all live alert triggers and </w:t>
+      </w:r>
+      <w:r>
+        <w:rPr>
+          <w:rFonts w:ascii="Arial" w:cs="Arial" w:eastAsia="Arial" w:hAnsi="Arial"/>
+          <w:b/>
+          <w:bCs/>
+          <w:color w:val="1A1A1A"/>
+        </w:rPr>
+        <w:t xml:space="preserve">F2 Booking &amp; event reminders</w:t>
+      </w:r>
+      <w:r>
+        <w:rPr>
+          <w:rFonts w:ascii="Arial" w:cs="Arial" w:eastAsia="Arial" w:hAnsi="Arial"/>
+          <w:color w:val="1A1A1A"/>
+        </w:rPr>
+        <w:t xml:space="preserve">. AI compresses the work into the 16 available working days. It reads the codebase for the assessment and generates a full regression suite for every live journey in days.</w:t>
       </w:r>
     </w:p>
     <w:tbl>
@@ -9399,7 +10486,7 @@
                 <w:sz w:val="17"/>
                 <w:szCs w:val="17"/>
               </w:rPr>
-              <w:t xml:space="preserve">Triage the defect backlog; fix critical/high issues in launch journeys; add automated regression for those journeys</w:t>
+              <w:t xml:space="preserve">AI-assisted triage of the defect backlog; fix critical/high issues in launch journeys; AI-generated regression suite for all live journeys</w:t>
             </w:r>
           </w:p>
         </w:tc>
@@ -9431,7 +10518,7 @@
                 <w:sz w:val="17"/>
                 <w:szCs w:val="17"/>
               </w:rPr>
-              <w:t xml:space="preserve">No open S1/S2 in launch scope</w:t>
+              <w:t xml:space="preserve">No open S1/S2 in launch scope; suite green</w:t>
             </w:r>
           </w:p>
         </w:tc>
@@ -9469,7 +10556,7 @@
                 <w:sz w:val="17"/>
                 <w:szCs w:val="17"/>
               </w:rPr>
-              <w:t xml:space="preserve">Security</w:t>
+              <w:t xml:space="preserve">F1 / F2</w:t>
             </w:r>
           </w:p>
         </w:tc>
@@ -9502,7 +10589,7 @@
                 <w:sz w:val="17"/>
                 <w:szCs w:val="17"/>
               </w:rPr>
-              <w:t xml:space="preserve">SAST, dependency, secret and DAST scans; VAPT of the launch surface; fix critical/high; harden headers, rate limits and OTP abuse controls</w:t>
+              <w:t xml:space="preserve">Email channel adapter and templates for existing triggers; reminder scheduler (T-24h, T-2h) with cancellation on booking change</w:t>
             </w:r>
           </w:p>
         </w:tc>
@@ -9535,7 +10622,7 @@
                 <w:sz w:val="17"/>
                 <w:szCs w:val="17"/>
               </w:rPr>
-              <w:t xml:space="preserve">VAPT retest clean for critical/high</w:t>
+              <w:t xml:space="preserve">Behind flags; enabled after UAT</w:t>
             </w:r>
           </w:p>
         </w:tc>
@@ -9572,7 +10659,7 @@
                 <w:sz w:val="17"/>
                 <w:szCs w:val="17"/>
               </w:rPr>
-              <w:t xml:space="preserve">Performance</w:t>
+              <w:t xml:space="preserve">Security</w:t>
             </w:r>
           </w:p>
         </w:tc>
@@ -9604,7 +10691,7 @@
                 <w:sz w:val="17"/>
                 <w:szCs w:val="17"/>
               </w:rPr>
-              <w:t xml:space="preserve">Load test the key journeys at SportSeek's launch concurrency (D5); tune queries, indexes and scaling settings</w:t>
+              <w:t xml:space="preserve">SAST, dependency, secret and DAST scans; VAPT of the launch surface; fix critical/high; harden headers, rate limits and OTP abuse controls</w:t>
             </w:r>
           </w:p>
         </w:tc>
@@ -9636,7 +10723,7 @@
                 <w:sz w:val="17"/>
                 <w:szCs w:val="17"/>
               </w:rPr>
-              <w:t xml:space="preserve">Targets met with headroom</w:t>
+              <w:t xml:space="preserve">VAPT retest clean for critical/high</w:t>
             </w:r>
           </w:p>
         </w:tc>
@@ -9674,7 +10761,7 @@
                 <w:sz w:val="17"/>
                 <w:szCs w:val="17"/>
               </w:rPr>
-              <w:t xml:space="preserve">Observability</w:t>
+              <w:t xml:space="preserve">Performance</w:t>
             </w:r>
           </w:p>
         </w:tc>
@@ -9707,7 +10794,7 @@
                 <w:sz w:val="17"/>
                 <w:szCs w:val="17"/>
               </w:rPr>
-              <w:t xml:space="preserve">Central logs, error tracking, uptime checks, dashboards and alerting with on-call routing</w:t>
+              <w:t xml:space="preserve">Load test the key journeys at SportSeek's launch concurrency (D5); tune queries, indexes and scaling settings</w:t>
             </w:r>
           </w:p>
         </w:tc>
@@ -9740,7 +10827,7 @@
                 <w:sz w:val="17"/>
                 <w:szCs w:val="17"/>
               </w:rPr>
-              <w:t xml:space="preserve">Dashboards and alerts verified in a drill</w:t>
+              <w:t xml:space="preserve">Targets met with headroom</w:t>
             </w:r>
           </w:p>
         </w:tc>
@@ -9777,7 +10864,7 @@
                 <w:sz w:val="17"/>
                 <w:szCs w:val="17"/>
               </w:rPr>
-              <w:t xml:space="preserve">Recoverability</w:t>
+              <w:t xml:space="preserve">Observability</w:t>
             </w:r>
           </w:p>
         </w:tc>
@@ -9809,7 +10896,7 @@
                 <w:sz w:val="17"/>
                 <w:szCs w:val="17"/>
               </w:rPr>
-              <w:t xml:space="preserve">Verify backups and a timed restore; rollback plan for the release</w:t>
+              <w:t xml:space="preserve">Central logs, error tracking, uptime checks, dashboards and alerting with on-call routing</w:t>
             </w:r>
           </w:p>
         </w:tc>
@@ -9841,7 +10928,7 @@
                 <w:sz w:val="17"/>
                 <w:szCs w:val="17"/>
               </w:rPr>
-              <w:t xml:space="preserve">Restore and rollback rehearsed on Staging</w:t>
+              <w:t xml:space="preserve">Dashboards and alerts verified in a drill</w:t>
             </w:r>
           </w:p>
         </w:tc>
@@ -9879,7 +10966,7 @@
                 <w:sz w:val="17"/>
                 <w:szCs w:val="17"/>
               </w:rPr>
-              <w:t xml:space="preserve">Store &amp; privacy</w:t>
+              <w:t xml:space="preserve">Recoverability</w:t>
             </w:r>
           </w:p>
         </w:tc>
@@ -9912,7 +10999,7 @@
                 <w:sz w:val="17"/>
                 <w:szCs w:val="17"/>
               </w:rPr>
-              <w:t xml:space="preserve">Check store policies (privacy labels, permissions, in-app account deletion); publish privacy policy and DPDP notice</w:t>
+              <w:t xml:space="preserve">Verify backups and a timed restore; rollback plan for the release</w:t>
             </w:r>
           </w:p>
         </w:tc>
@@ -9945,7 +11032,7 @@
                 <w:sz w:val="17"/>
                 <w:szCs w:val="17"/>
               </w:rPr>
-              <w:t xml:space="preserve">Submissions accepted or on track</w:t>
+              <w:t xml:space="preserve">Restore and rollback rehearsed on Staging</w:t>
             </w:r>
           </w:p>
         </w:tc>
@@ -9982,7 +11069,7 @@
                 <w:sz w:val="17"/>
                 <w:szCs w:val="17"/>
               </w:rPr>
-              <w:t xml:space="preserve">Payments sanity</w:t>
+              <w:t xml:space="preserve">Store &amp; privacy</w:t>
             </w:r>
           </w:p>
         </w:tc>
@@ -10014,7 +11101,7 @@
                 <w:sz w:val="17"/>
                 <w:szCs w:val="17"/>
               </w:rPr>
-              <w:t xml:space="preserve">End-to-end payment, webhook and failure-path verification against the live gateway configuration</w:t>
+              <w:t xml:space="preserve">Check store policies (privacy labels, permissions, in-app account deletion); publish privacy policy and DPDP notice</w:t>
             </w:r>
           </w:p>
         </w:tc>
@@ -10046,6 +11133,110 @@
                 <w:sz w:val="17"/>
                 <w:szCs w:val="17"/>
               </w:rPr>
+              <w:t xml:space="preserve">Submissions accepted or on track</w:t>
+            </w:r>
+          </w:p>
+        </w:tc>
+      </w:tr>
+      <w:tr>
+        <w:trPr>
+          <w:cantSplit/>
+        </w:trPr>
+        <w:tc>
+          <w:tcPr>
+            <w:tcW w:type="dxa" w:w="2216"/>
+            <w:tcBorders>
+              <w:top w:val="single" w:color="C9CED8" w:sz="4"/>
+              <w:left w:val="single" w:color="C9CED8" w:sz="4"/>
+              <w:bottom w:val="single" w:color="C9CED8" w:sz="4"/>
+              <w:right w:val="single" w:color="C9CED8" w:sz="4"/>
+            </w:tcBorders>
+            <w:shd w:fill="F3F5F9" w:color="auto" w:val="clear"/>
+            <w:tcMar>
+              <w:top w:type="dxa" w:w="60"/>
+              <w:left w:type="dxa" w:w="90"/>
+              <w:bottom w:type="dxa" w:w="60"/>
+              <w:right w:type="dxa" w:w="90"/>
+            </w:tcMar>
+            <w:vAlign w:val="top"/>
+          </w:tcPr>
+          <w:p>
+            <w:pPr>
+              <w:spacing w:after="20" w:line="250"/>
+            </w:pPr>
+            <w:r>
+              <w:rPr>
+                <w:rFonts w:ascii="Arial" w:cs="Arial" w:eastAsia="Arial" w:hAnsi="Arial"/>
+                <w:color w:val="1A1A1A"/>
+                <w:sz w:val="17"/>
+                <w:szCs w:val="17"/>
+              </w:rPr>
+              <w:t xml:space="preserve">Payments sanity</w:t>
+            </w:r>
+          </w:p>
+        </w:tc>
+        <w:tc>
+          <w:tcPr>
+            <w:tcW w:type="dxa" w:w="5011"/>
+            <w:tcBorders>
+              <w:top w:val="single" w:color="C9CED8" w:sz="4"/>
+              <w:left w:val="single" w:color="C9CED8" w:sz="4"/>
+              <w:bottom w:val="single" w:color="C9CED8" w:sz="4"/>
+              <w:right w:val="single" w:color="C9CED8" w:sz="4"/>
+            </w:tcBorders>
+            <w:shd w:fill="F3F5F9" w:color="auto" w:val="clear"/>
+            <w:tcMar>
+              <w:top w:type="dxa" w:w="60"/>
+              <w:left w:type="dxa" w:w="90"/>
+              <w:bottom w:type="dxa" w:w="60"/>
+              <w:right w:type="dxa" w:w="90"/>
+            </w:tcMar>
+            <w:vAlign w:val="top"/>
+          </w:tcPr>
+          <w:p>
+            <w:pPr>
+              <w:spacing w:after="20" w:line="250"/>
+            </w:pPr>
+            <w:r>
+              <w:rPr>
+                <w:rFonts w:ascii="Arial" w:cs="Arial" w:eastAsia="Arial" w:hAnsi="Arial"/>
+                <w:color w:val="1A1A1A"/>
+                <w:sz w:val="17"/>
+                <w:szCs w:val="17"/>
+              </w:rPr>
+              <w:t xml:space="preserve">End-to-end payment, webhook and failure-path verification against the live gateway configuration</w:t>
+            </w:r>
+          </w:p>
+        </w:tc>
+        <w:tc>
+          <w:tcPr>
+            <w:tcW w:type="dxa" w:w="2411"/>
+            <w:tcBorders>
+              <w:top w:val="single" w:color="C9CED8" w:sz="4"/>
+              <w:left w:val="single" w:color="C9CED8" w:sz="4"/>
+              <w:bottom w:val="single" w:color="C9CED8" w:sz="4"/>
+              <w:right w:val="single" w:color="C9CED8" w:sz="4"/>
+            </w:tcBorders>
+            <w:shd w:fill="F3F5F9" w:color="auto" w:val="clear"/>
+            <w:tcMar>
+              <w:top w:type="dxa" w:w="60"/>
+              <w:left w:type="dxa" w:w="90"/>
+              <w:bottom w:type="dxa" w:w="60"/>
+              <w:right w:type="dxa" w:w="90"/>
+            </w:tcMar>
+            <w:vAlign w:val="top"/>
+          </w:tcPr>
+          <w:p>
+            <w:pPr>
+              <w:spacing w:after="20" w:line="250"/>
+            </w:pPr>
+            <w:r>
+              <w:rPr>
+                <w:rFonts w:ascii="Arial" w:cs="Arial" w:eastAsia="Arial" w:hAnsi="Arial"/>
+                <w:color w:val="1A1A1A"/>
+                <w:sz w:val="17"/>
+                <w:szCs w:val="17"/>
+              </w:rPr>
               <w:t xml:space="preserve">Test transactions reconciled</w:t>
             </w:r>
           </w:p>
@@ -10063,7 +11254,7 @@
         <w:pageBreakBefore/>
       </w:pPr>
       <w:r>
-        <w:t xml:space="preserve">10. Data migration approach</w:t>
+        <w:t xml:space="preserve">11. Data migration approach</w:t>
       </w:r>
     </w:p>
     <w:tbl>
@@ -10226,7 +11417,7 @@
                 <w:sz w:val="18"/>
                 <w:szCs w:val="18"/>
               </w:rPr>
-              <w:t xml:space="preserve">Identity consolidation (2A.1)</w:t>
+              <w:t xml:space="preserve">Identity consolidation (R3)</w:t>
             </w:r>
           </w:p>
         </w:tc>
@@ -10328,7 +11519,7 @@
                 <w:sz w:val="18"/>
                 <w:szCs w:val="18"/>
               </w:rPr>
-              <w:t xml:space="preserve">Facilities → generalised services (2A.2)</w:t>
+              <w:t xml:space="preserve">Facilities → generalised services (R4)</w:t>
             </w:r>
           </w:p>
         </w:tc>
@@ -10431,7 +11622,7 @@
                 <w:sz w:val="18"/>
                 <w:szCs w:val="18"/>
               </w:rPr>
-              <w:t xml:space="preserve">Historical events import (2A.3)</w:t>
+              <w:t xml:space="preserve">Historical events import (R6)</w:t>
             </w:r>
           </w:p>
         </w:tc>
@@ -10533,7 +11724,7 @@
                 <w:sz w:val="18"/>
                 <w:szCs w:val="18"/>
               </w:rPr>
-              <w:t xml:space="preserve">Ledger back-fill (2A.3)</w:t>
+              <w:t xml:space="preserve">Ledger back-fill (R5)</w:t>
             </w:r>
           </w:p>
         </w:tc>
@@ -10616,7 +11807,7 @@
         <w:pageBreakBefore/>
       </w:pPr>
       <w:r>
-        <w:t xml:space="preserve">11. Key technical decisions (ADR backlog)</w:t>
+        <w:t xml:space="preserve">12. Key technical decisions (ADR backlog)</w:t>
       </w:r>
     </w:p>
     <w:p>
@@ -10991,7 +12182,7 @@
                 <w:sz w:val="17"/>
                 <w:szCs w:val="17"/>
               </w:rPr>
-              <w:t xml:space="preserve">06 Nov 2026</w:t>
+              <w:t xml:space="preserve">23 Oct 2026</w:t>
             </w:r>
           </w:p>
         </w:tc>
@@ -11161,7 +12352,7 @@
                 <w:sz w:val="17"/>
                 <w:szCs w:val="17"/>
               </w:rPr>
-              <w:t xml:space="preserve">06 Nov 2026</w:t>
+              <w:t xml:space="preserve">23 Oct 2026</w:t>
             </w:r>
           </w:p>
         </w:tc>
@@ -11326,7 +12517,7 @@
                 <w:sz w:val="17"/>
                 <w:szCs w:val="17"/>
               </w:rPr>
-              <w:t xml:space="preserve">06 Nov 2026</w:t>
+              <w:t xml:space="preserve">23 Oct 2026</w:t>
             </w:r>
           </w:p>
         </w:tc>
@@ -11496,7 +12687,7 @@
                 <w:sz w:val="17"/>
                 <w:szCs w:val="17"/>
               </w:rPr>
-              <w:t xml:space="preserve">27 Nov 2026</w:t>
+              <w:t xml:space="preserve">23 Oct 2026</w:t>
             </w:r>
           </w:p>
         </w:tc>
@@ -11661,7 +12852,7 @@
                 <w:sz w:val="17"/>
                 <w:szCs w:val="17"/>
               </w:rPr>
-              <w:t xml:space="preserve">13 Nov 2026</w:t>
+              <w:t xml:space="preserve">23 Oct 2026</w:t>
             </w:r>
           </w:p>
         </w:tc>
@@ -11831,7 +13022,7 @@
                 <w:sz w:val="17"/>
                 <w:szCs w:val="17"/>
               </w:rPr>
-              <w:t xml:space="preserve">13 Nov 2026</w:t>
+              <w:t xml:space="preserve">23 Oct 2026</w:t>
             </w:r>
           </w:p>
         </w:tc>
@@ -11996,7 +13187,7 @@
                 <w:sz w:val="17"/>
                 <w:szCs w:val="17"/>
               </w:rPr>
-              <w:t xml:space="preserve">13 Nov 2026</w:t>
+              <w:t xml:space="preserve">23 Oct 2026</w:t>
             </w:r>
           </w:p>
         </w:tc>
@@ -12013,7 +13204,7 @@
         <w:pageBreakBefore/>
       </w:pPr>
       <w:r>
-        <w:t xml:space="preserve">12. Technical risks and mitigations</w:t>
+        <w:t xml:space="preserve">13. Technical risks and mitigations</w:t>
       </w:r>
     </w:p>
     <w:tbl>
@@ -12540,7 +13731,7 @@
         <w:pageBreakBefore/>
       </w:pPr>
       <w:r>
-        <w:t xml:space="preserve">13. Why Srivin Platforms</w:t>
+        <w:t xml:space="preserve">14. Why Srivin Platforms</w:t>
       </w:r>
     </w:p>
     <w:p>
@@ -12552,7 +13743,7 @@
           <w:rFonts w:ascii="Arial" w:cs="Arial" w:eastAsia="Arial" w:hAnsi="Arial"/>
           <w:color w:val="1A1A1A"/>
         </w:rPr>
-        <w:t xml:space="preserve">SportSeek needs a partner that can do three things at once: launch safely in weeks, re-foundation a live platform over months, and leave SportSeek stronger and more independent at the end. This approach is built for exactly that combination:</w:t>
+        <w:t xml:space="preserve">SportSeek needs a partner that can do four things at once: launch safely in weeks, ship new value every month, re-foundation a live platform without breaking it, and leave SportSeek stronger and more independent at the end. This approach is built for exactly that combination:</w:t>
       </w:r>
     </w:p>
     <w:tbl>
@@ -13029,7 +14220,7 @@
                 <w:sz w:val="18"/>
                 <w:szCs w:val="18"/>
               </w:rPr>
-              <w:t xml:space="preserve">Predictability</w:t>
+              <w:t xml:space="preserve">Faster go-to-market</w:t>
             </w:r>
           </w:p>
         </w:tc>
@@ -13062,7 +14253,76 @@
                 <w:sz w:val="18"/>
                 <w:szCs w:val="18"/>
               </w:rPr>
-              <w:t xml:space="preserve">A dated plan with explicit dependencies and critical path, stage gates and weekly transparency (see the WBS &amp; Integrated Project Plan and the Project Delivery Model).</w:t>
+              <w:t xml:space="preserve">An AI-native pod that ships two features to production every month from launch day, and completes Phase 2A on 23 Mar 2027 with less than half the effort of a conventional team.</w:t>
+            </w:r>
+          </w:p>
+        </w:tc>
+      </w:tr>
+      <w:tr>
+        <w:trPr>
+          <w:cantSplit/>
+        </w:trPr>
+        <w:tc>
+          <w:tcPr>
+            <w:tcW w:type="dxa" w:w="3276"/>
+            <w:tcBorders>
+              <w:top w:val="single" w:color="C9CED8" w:sz="4"/>
+              <w:left w:val="single" w:color="C9CED8" w:sz="4"/>
+              <w:bottom w:val="single" w:color="C9CED8" w:sz="4"/>
+              <w:right w:val="single" w:color="C9CED8" w:sz="4"/>
+            </w:tcBorders>
+            <w:tcMar>
+              <w:top w:type="dxa" w:w="60"/>
+              <w:left w:type="dxa" w:w="90"/>
+              <w:bottom w:type="dxa" w:w="60"/>
+              <w:right w:type="dxa" w:w="90"/>
+            </w:tcMar>
+            <w:vAlign w:val="top"/>
+          </w:tcPr>
+          <w:p>
+            <w:pPr>
+              <w:spacing w:after="20" w:line="250"/>
+            </w:pPr>
+            <w:r>
+              <w:rPr>
+                <w:rFonts w:ascii="Arial" w:cs="Arial" w:eastAsia="Arial" w:hAnsi="Arial"/>
+                <w:color w:val="1A1A1A"/>
+                <w:sz w:val="18"/>
+                <w:szCs w:val="18"/>
+              </w:rPr>
+              <w:t xml:space="preserve">Predictability</w:t>
+            </w:r>
+          </w:p>
+        </w:tc>
+        <w:tc>
+          <w:tcPr>
+            <w:tcW w:type="dxa" w:w="6362"/>
+            <w:tcBorders>
+              <w:top w:val="single" w:color="C9CED8" w:sz="4"/>
+              <w:left w:val="single" w:color="C9CED8" w:sz="4"/>
+              <w:bottom w:val="single" w:color="C9CED8" w:sz="4"/>
+              <w:right w:val="single" w:color="C9CED8" w:sz="4"/>
+            </w:tcBorders>
+            <w:tcMar>
+              <w:top w:type="dxa" w:w="60"/>
+              <w:left w:type="dxa" w:w="90"/>
+              <w:bottom w:type="dxa" w:w="60"/>
+              <w:right w:type="dxa" w:w="90"/>
+            </w:tcMar>
+            <w:vAlign w:val="top"/>
+          </w:tcPr>
+          <w:p>
+            <w:pPr>
+              <w:spacing w:after="20" w:line="250"/>
+            </w:pPr>
+            <w:r>
+              <w:rPr>
+                <w:rFonts w:ascii="Arial" w:cs="Arial" w:eastAsia="Arial" w:hAnsi="Arial"/>
+                <w:color w:val="1A1A1A"/>
+                <w:sz w:val="18"/>
+                <w:szCs w:val="18"/>
+              </w:rPr>
+              <w:t xml:space="preserve">Fixed monthly release dates, dated dependencies, and weekly working software (see the WBS &amp; Integrated Project Plan and the Project Delivery Model).</w:t>
             </w:r>
           </w:p>
         </w:tc>
@@ -14556,6 +15816,12 @@
   </w:num>
   <w:num w:numId="4">
     <w:abstractNumId w:val="6"/>
+    <w:lvlOverride w:ilvl="0">
+      <w:startOverride w:val="1"/>
+    </w:lvlOverride>
+  </w:num>
+  <w:num w:numId="5">
+    <w:abstractNumId w:val="7"/>
     <w:lvlOverride w:ilvl="0">
       <w:startOverride w:val="1"/>
     </w:lvlOverride>

</xml_diff>